<commit_message>
RP7.3 RV.2: correzioni testuali (coerenza ordinamento, corsivi, didascalia Tab.10)
Applica alla copia consegnata della RP7.3 RV.2 le correzioni emerse
dalla rilettura durante la rigenerazione della RP7.8 (solo testo;
nessun valore, tabella o figura cambia):

- sez. 3.7 e 4.3: l'ordinamento D240>D060>D020 e stabile in 7 scenari
  su 8 (inversione D060/D020 nel focus multidimensionale alpha=0,6);
  allineati i passaggi che dicevano in tutti gli scenari.
- ripristinati i corsivi (consistency ratio, footprint family): niente
  piu asterischi letterali.
- didascalia Tab.10: esplicitata la definizione del TSI_rel di Gruppo
  (media dei TSI_rel di unita ponderata sulla produzione 2025).

Versione e data invariate (RV.2, 19.10.2026).

Co-Authored-By: Claude Opus 4.8 <noreply@anthropic.com>
Claude-Session: https://claude.ai/code/session_018CWugXGqWf7JWoD3J1u3H2
</commit_message>
<xml_diff>
--- a/RP 7.3 Report di Assessment termodinamico della fabbrica RV.2.docx
+++ b/RP 7.3 Report di Assessment termodinamico della fabbrica RV.2.docx
@@ -256,7 +256,20 @@
         <w:rPr>
           <w:rFonts w:ascii="Calibri" w:hAnsi="Calibri"/>
         </w:rPr>
-        <w:t>La sostenibilità combina grandezze eterogenee (kg CO₂-eq, m³, €, ore, DALY, KPI di processo) non direttamente sommabili. START adotta l'exergia come metrica fisica universale: la conversione in J/GJ risolve la commensurabilità, mentre l'AHP (con verifica del *consistency ratio*) risolve la ponderazione. I due livelli restano distinti: Eq. (6)–(8).</w:t>
+        <w:t xml:space="preserve">La sostenibilità combina grandezze eterogenee (kg CO₂-eq, m³, €, ore, DALY, KPI di processo) non direttamente sommabili. START adotta l'exergia come metrica fisica universale: la conversione in J/GJ risolve la commensurabilità, mentre l'AHP (con verifica del </w:t>
+      </w:r>
+      <w:r>
+        <w:rPr>
+          <w:rFonts w:ascii="Calibri" w:hAnsi="Calibri"/>
+          <w:i/>
+        </w:rPr>
+        <w:t xml:space="preserve">consistency ratio</w:t>
+      </w:r>
+      <w:r>
+        <w:rPr>
+          <w:rFonts w:ascii="Calibri" w:hAnsi="Calibri"/>
+        </w:rPr>
+        <w:t xml:space="preserve">) risolve la ponderazione. I due livelli restano distinti: Eq. (6)–(8).</w:t>
       </w:r>
     </w:p>
     <w:p>
@@ -5309,11 +5322,6 @@
           <w:rFonts w:ascii="Calibri" w:hAnsi="Calibri"/>
         </w:rPr>
         <w:t xml:space="preserve">La Tabella 4 ricostruisce il riferimento exergetico di processo Ex_ref = Ex_el + Ex_fuel per ciascuna unità e anno. In tutte le righe la componente di combustibile domina il bilancio (circa l'80 % di Ex_ref, contro il ~20 % della quota elettrica): è l'impronta del processo ceramico, fortemente termico (essiccamento e cottura). La colonna Ψ, efficienza exergetica di </w:t>
-      </w:r>
-      <w:r>
-        <w:rPr>
-          <w:rFonts w:ascii="Calibri" w:hAnsi="Calibri"/>
-        </w:rPr>
         <w:lastRenderedPageBreak/>
         <w:t>secondo principio, è in crescita monotòna anno su anno per tutte le unità (D020 0,154→0,164; D060 0,163→0,173; D240 0,168→0,176): il sistema recupera progressivamente più exergia utile a parità di risorsa immessa. Va letta con attenzione la riga D020/2025: l'Ex_ref di 114.990 GJ è inferiore agli anni precedenti non perché l'impianto consumi relativamente meno, ma perché la finestra è di soli 7 mesi; è una grandezza estensiva di periodo e non va confrontata con gli anni pieni, mentre il suo Ψ = 0,164 (intensivo) resta pienamente confrontabile ed è il più alto della serie D020.</w:t>
       </w:r>
@@ -8726,11 +8734,6 @@
           <w:rFonts w:ascii="Calibri" w:hAnsi="Calibri"/>
         </w:rPr>
         <w:t xml:space="preserve">La Tabella 6 applica i pesi AHP alla SA grezza (SA_w) e la rapporta al riferimento exergetico per ottenere lo score intensivo Φ = SA_w/Ex_ref, adimensionale e quindi confrontabile fra unità e anni. Il dato più istruttivo è la convergenza di Φ attorno a 0,0194 nel 2023 per tutte e tre le unità: partendo da basi 2022 omogenee, il primo anno di serie fotografa condizioni simili, e la divaricazione successiva misura i diversi percorsi di miglioramento. Nel 2025 Φ sale a 0,07–0,08; il valore più alto è quello di D020/2025 (0,0784): poiché numeratore e denominatore sono riferiti alla medesima finestra omologa, il </w:t>
-      </w:r>
-      <w:r>
-        <w:rPr>
-          <w:rFonts w:ascii="Calibri" w:hAnsi="Calibri"/>
-        </w:rPr>
         <w:lastRenderedPageBreak/>
         <w:t>rapporto resta confrontabile e segnala che, rispetto al proprio 2022 gennaio–luglio, D020 ha compiuto il progresso relativo più ampio.</w:t>
       </w:r>
@@ -10560,26 +10563,39 @@
           <w:rFonts w:ascii="Calibri" w:hAnsi="Calibri"/>
           <w:b/>
         </w:rPr>
-        <w:t>&gt; 1</w:t>
+        <w:t xml:space="preserve">&gt; 1</w:t>
       </w:r>
       <w:r>
         <w:rPr>
           <w:rFonts w:ascii="Calibri" w:hAnsi="Calibri"/>
         </w:rPr>
-        <w:t xml:space="preserve"> (intervallo complessivo 1,237–1,539) e l'</w:t>
+        <w:t xml:space="preserve"> (intervallo complessivo 1,237–1,539) e </w:t>
       </w:r>
       <w:r>
         <w:rPr>
           <w:rFonts w:ascii="Calibri" w:hAnsi="Calibri"/>
           <w:b/>
         </w:rPr>
-        <w:t>ordinamento D240 &gt; D060 &gt; D020</w:t>
+        <w:t xml:space="preserve">D240 resta l’unità con il TSI_abs 2025 più alto</w:t>
       </w:r>
       <w:r>
         <w:rPr>
           <w:rFonts w:ascii="Calibri" w:hAnsi="Calibri"/>
         </w:rPr>
-        <w:t xml:space="preserve"> (per TSI_abs 2025) si mantiene: il miglioramento e la gerarchia assoluta sono robusti.</w:t>
+        <w:t xml:space="preserve">; l’ordinamento D240 &gt; D060 &gt; D020 si mantiene in </w:t>
+      </w:r>
+      <w:r>
+        <w:rPr>
+          <w:rFonts w:ascii="Calibri" w:hAnsi="Calibri"/>
+          <w:b/>
+        </w:rPr>
+        <w:t xml:space="preserve">sette scenari su otto</w:t>
+      </w:r>
+      <w:r>
+        <w:rPr>
+          <w:rFonts w:ascii="Calibri" w:hAnsi="Calibri"/>
+        </w:rPr>
+        <w:t xml:space="preserve">, con la sola inversione fra D060 e D020 nel focus multidimensionale. Il segno del miglioramento è robusto rispetto a tutte le ipotesi.</w:t>
       </w:r>
     </w:p>
     <w:p>
@@ -11491,7 +11507,7 @@
           <w:color w:val="333333"/>
           <w:sz w:val="18"/>
         </w:rPr>
-        <w:t xml:space="preserve"> — Indici di Gruppo (D020/2025 pesa per la produzione del periodo).</w:t>
+        <w:t xml:space="preserve"> — Indici di Gruppo (D020/2025 pesa per la produzione del periodo). TSI_rel di Gruppo: media dei TSI_rel di unità ponderata sulla produzione 2025.</w:t>
       </w:r>
     </w:p>
     <w:p>
@@ -12577,7 +12593,20 @@
         <w:rPr>
           <w:rFonts w:ascii="Calibri" w:hAnsi="Calibri"/>
         </w:rPr>
-        <w:t>Sulla serie 2023–2025 il TSI cresce in tutte le unità; il miglioramento relativo 2025/2023 è +39,8 % per D020, +34,5 % per D060, +32,2 % per D240, con un valore medio di Gruppo di +34,6 %. L'ordinamento assoluto (TSI_abs 2025) è D240 (0,1239) &gt; D060 (0,1227) &gt; D020 (0,1212), coerente con la *footprint family* di OR6 (impianto più recente più performante).</w:t>
+        <w:t xml:space="preserve">Sulla serie 2023–2025 il TSI cresce in tutte le unità; il miglioramento relativo 2025/2023 è +39,8 % per D020, +34,5 % per D060, +32,2 % per D240, con un valore medio di Gruppo di +34,6 %. L'ordinamento assoluto (TSI_abs 2025) è D240 (0,1239) &gt; D060 (0,1227) &gt; D020 (0,1212), coerente con la </w:t>
+      </w:r>
+      <w:r>
+        <w:rPr>
+          <w:rFonts w:ascii="Calibri" w:hAnsi="Calibri"/>
+          <w:i/>
+        </w:rPr>
+        <w:t xml:space="preserve">footprint family</w:t>
+      </w:r>
+      <w:r>
+        <w:rPr>
+          <w:rFonts w:ascii="Calibri" w:hAnsi="Calibri"/>
+        </w:rPr>
+        <w:t xml:space="preserve"> di OR6 (impianto più recente più performante).</w:t>
       </w:r>
     </w:p>
     <w:p>
@@ -12629,7 +12658,7 @@
         <w:rPr>
           <w:rFonts w:ascii="Calibri" w:hAnsi="Calibri"/>
         </w:rPr>
-        <w:t>L'analisi di sensibilità conferma TSI_rel &gt; 1 e l'ordinamento assoluto in tutti gli scenari. Si segnala, rispetto alle revisioni precedenti, che l'intervallo per-unità di TSI_rel si allarga a ≈ 1,32–1,40 (D240 1,322 · D060 1,345 · D020 1,398): il precedente riferimento «1,32–1,36» non è più valido perché D020, con i dati reali, è l'unità con il miglioramento relativo più alto. L'ordinamento assoluto D240 &gt; D060 &gt; D020 resta invariato.</w:t>
+        <w:t>L’analisi di sensibilità conferma TSI_rel &gt; 1 in tutti gli scenari e l’ordinamento assoluto in sette scenari su otto (nel focus multidimensionale D020 supera D060). Si segnala, rispetto alle revisioni precedenti, che l’intervallo per-unità di TSI_rel si allarga a ≈ 1,32–1,40 (D240 1,322 · D060 1,345 · D020 1,398): il precedente riferimento «1,32–1,36» non è più valido perché D020, con i dati reali, è l’unità con il miglioramento relativo più alto. Nel caso base l’ordinamento assoluto D240 &gt; D060 &gt; D020 resta invariato rispetto alla RV.1.</w:t>
       </w:r>
     </w:p>
     <w:p>

</xml_diff>